<commit_message>
feat(demo 17/10): ẩn danh cơ quan ban hành thành Đảng ủy UBND phường XYZ (dự thảo và báo cáo rà soát)
Co-Authored-By: Claude Opus 5.5 <noreply@anthropic.com>
</commit_message>
<xml_diff>
--- a/30-Ket-Qua/2026-10-12/De-Mo-17-10/Du-lieu-gia-dinh/D4-Du-thao-can-ra-soat/Du-thao_Chuong-trinh-cong-tac-thang-10-2026_van-ban-Dang_an-danh.docx
+++ b/30-Ket-Qua/2026-10-12/De-Mo-17-10/Du-lieu-gia-dinh/D4-Du-thao-can-ra-soat/Du-thao_Chuong-trinh-cong-tac-thang-10-2026_van-ban-Dang_an-danh.docx
@@ -58,7 +58,7 @@
                 <w:sz w:val="28"/>
                 <w:szCs w:val="28"/>
               </w:rPr>
-              <w:t xml:space="preserve">ĐẢNG ỦY </w:t>
+              <w:t xml:space="preserve">ĐẢNG ỦY ỦY BAN NHÂN DÂN PHƯỜNG XYZ</w:t>
             </w:r>
             <w:r>
               <w:rPr>
@@ -67,7 +67,7 @@
                 <w:sz w:val="28"/>
                 <w:szCs w:val="28"/>
               </w:rPr>
-              <w:t>ỦY BAN NHÂN DÂN TỈNH</w:t>
+              <w:t xml:space="preserve"/>
             </w:r>
           </w:p>
           <w:p>
@@ -377,23 +377,23 @@
           <w:sz w:val="28"/>
           <w:szCs w:val="28"/>
         </w:rPr>
-        <w:t xml:space="preserve">Đảng ủy </w:t>
-      </w:r>
-      <w:r>
-        <w:rPr>
-          <w:b/>
-          <w:sz w:val="28"/>
-          <w:szCs w:val="28"/>
-        </w:rPr>
-        <w:t>Ủy ban nhân dân</w:t>
-      </w:r>
-      <w:r>
-        <w:rPr>
-          <w:b/>
-          <w:sz w:val="28"/>
-          <w:szCs w:val="28"/>
-        </w:rPr>
-        <w:t xml:space="preserve"> tỉnh</w:t>
+        <w:t xml:space="preserve">Đảng ủy Ủy ban nhân dân phường XYZ</w:t>
+      </w:r>
+      <w:r>
+        <w:rPr>
+          <w:b/>
+          <w:sz w:val="28"/>
+          <w:szCs w:val="28"/>
+        </w:rPr>
+        <w:t xml:space="preserve"/>
+      </w:r>
+      <w:r>
+        <w:rPr>
+          <w:b/>
+          <w:sz w:val="28"/>
+          <w:szCs w:val="28"/>
+        </w:rPr>
+        <w:t xml:space="preserve"/>
       </w:r>
       <w:r>
         <w:rPr>
@@ -458,7 +458,7 @@
           <w:sz w:val="28"/>
           <w:szCs w:val="28"/>
         </w:rPr>
-        <w:t xml:space="preserve"> Chương trình công tác toàn khóa của Ban Chấp hành Đảng bộ UBND tỉnh khóa I, nhiệm kỳ 2025 - 2030 </w:t>
+        <w:t xml:space="preserve"> Chương trình công tác toàn khóa của Ban Chấp hành Đảng bộ UBND phường XYZ khóa I, nhiệm kỳ 2025 - 2030 </w:t>
       </w:r>
       <w:r>
         <w:rPr>
@@ -492,7 +492,7 @@
           <w:sz w:val="28"/>
           <w:szCs w:val="28"/>
         </w:rPr>
-        <w:t xml:space="preserve">- Căn cứ Chương trình công tác trọng tâm năm 2026 của Đảng ủy, Ban Thường vụ Đảng ủy UBND tỉnh </w:t>
+        <w:t xml:space="preserve">- Căn cứ Chương trình công tác trọng tâm năm 2026 của Đảng ủy, Ban Thường vụ Đảng ủy UBND phường XYZ </w:t>
       </w:r>
       <w:r>
         <w:rPr>
@@ -538,7 +538,7 @@
           <w:sz w:val="28"/>
           <w:szCs w:val="28"/>
         </w:rPr>
-        <w:t xml:space="preserve">2026 của Ban Thường vụ Đảng ủy UBND tỉnh </w:t>
+        <w:t xml:space="preserve">2026 của Ban Thường vụ Đảng ủy UBND phường XYZ </w:t>
       </w:r>
       <w:r>
         <w:rPr>
@@ -611,7 +611,7 @@
           <w:sz w:val="28"/>
           <w:szCs w:val="28"/>
         </w:rPr>
-        <w:t xml:space="preserve">Ban Thường vụ Đảng ủy UBND tỉnh xây dựng Chương trình công tác trọng tâm tháng </w:t>
+        <w:t xml:space="preserve">Ban Thường vụ Đảng ủy UBND phường XYZ xây dựng Chương trình công tác trọng tâm tháng </w:t>
       </w:r>
       <w:r>
         <w:rPr>
@@ -712,15 +712,15 @@
           <w:sz w:val="28"/>
           <w:szCs w:val="28"/>
         </w:rPr>
-        <w:t xml:space="preserve">Chương trình hành động số 11-CTr/ĐU ngày 14/4/2026 của Ban Chấp hành Đảng bộ UBND tỉnh</w:t>
-      </w:r>
-      <w:r>
-        <w:rPr>
-          <w:bCs/>
-          <w:sz w:val="28"/>
-          <w:szCs w:val="28"/>
-        </w:rPr>
-        <w:t xml:space="preserve"> thực hiện Nghị quyết Đại hội đại biểu toàn quốc lần thứ XIV của Đảng, Nghị quyết Đại hội đại biểu Đảng bộ tỉnh và Nghị quyết Đại hội đại biểu Đảng bộ UBND tỉnh lần thứ I, nhiệm kỳ 2025 - 2030 </w:t>
+        <w:t xml:space="preserve">Chương trình hành động số 11-CTr/ĐU ngày 14/4/2026 của Ban Chấp hành Đảng bộ UBND phường XYZ</w:t>
+      </w:r>
+      <w:r>
+        <w:rPr>
+          <w:bCs/>
+          <w:sz w:val="28"/>
+          <w:szCs w:val="28"/>
+        </w:rPr>
+        <w:t xml:space="preserve"> thực hiện Nghị quyết Đại hội đại biểu toàn quốc lần thứ XIV của Đảng, Nghị quyết Đại hội đại biểu Đảng bộ tỉnh và Nghị quyết Đại hội đại biểu Đảng bộ UBND phường XYZ lần thứ I, nhiệm kỳ 2025 - 2030 </w:t>
       </w:r>
       <w:r>
         <w:rPr>
@@ -776,7 +776,7 @@
           <w:sz w:val="28"/>
           <w:szCs w:val="28"/>
         </w:rPr>
-        <w:t>Ban Chấp hành Đảng bộ UBND tỉnh.</w:t>
+        <w:t xml:space="preserve">Ban Chấp hành Đảng bộ UBND phường XYZ.</w:t>
       </w:r>
     </w:p>
     <w:bookmarkEnd w:id="1"/>
@@ -917,7 +917,7 @@
           <w:szCs w:val="28"/>
           <w:shd w:val="clear" w:color="auto" w:fill="FFFFFF"/>
         </w:rPr>
-        <w:t xml:space="preserve">Lãnh đạo, chỉ đạo UBND tỉnh và các cơ quan liên quan khẩn trương hoàn thiện các </w:t>
+        <w:t xml:space="preserve">Lãnh đạo, chỉ đạo UBND phường và các cơ quan liên quan khẩn trương hoàn thiện các </w:t>
       </w:r>
       <w:r>
         <w:rPr>
@@ -933,7 +933,7 @@
           <w:szCs w:val="28"/>
           <w:shd w:val="clear" w:color="auto" w:fill="FFFFFF"/>
         </w:rPr>
-        <w:t xml:space="preserve"> thuộc trách nhiệm của Ban Thường vụ Đảng ủy UBND tỉnh để trình Ban Thường vụ Tỉnh ủy trong tháng </w:t>
+        <w:t xml:space="preserve"> thuộc trách nhiệm của Ban Thường vụ Đảng ủy UBND phường XYZ để trình Ban Thường vụ Tỉnh ủy trong tháng </w:t>
       </w:r>
       <w:r>
         <w:rPr>
@@ -1217,7 +1217,7 @@
           <w:sz w:val="28"/>
           <w:szCs w:val="28"/>
         </w:rPr>
-        <w:t>Thường trực Đảng ủy UBND tỉnh.</w:t>
+        <w:t xml:space="preserve">Thường trực Đảng ủy UBND phường XYZ.</w:t>
       </w:r>
     </w:p>
     <w:p>
@@ -1343,7 +1343,7 @@
           <w:sz w:val="28"/>
           <w:szCs w:val="28"/>
         </w:rPr>
-        <w:t>Thường trực Đảng ủy UBND tỉnh.</w:t>
+        <w:t xml:space="preserve">Thường trực Đảng ủy UBND phường XYZ.</w:t>
       </w:r>
     </w:p>
     <w:p>
@@ -1491,7 +1491,7 @@
           <w:sz w:val="28"/>
           <w:szCs w:val="28"/>
         </w:rPr>
-        <w:t>Thường trực Đảng ủy UBND tỉnh.</w:t>
+        <w:t xml:space="preserve">Thường trực Đảng ủy UBND phường XYZ.</w:t>
       </w:r>
     </w:p>
     <w:p>
@@ -1640,7 +1640,7 @@
           <w:sz w:val="28"/>
           <w:szCs w:val="28"/>
         </w:rPr>
-        <w:t>Thường trực Đảng ủy UBND tỉnh.</w:t>
+        <w:t xml:space="preserve">Thường trực Đảng ủy UBND phường XYZ.</w:t>
       </w:r>
     </w:p>
     <w:p>
@@ -1766,7 +1766,7 @@
           <w:sz w:val="28"/>
           <w:szCs w:val="28"/>
         </w:rPr>
-        <w:t xml:space="preserve">kinh tế - xã hội do UBND tỉnh trình sau khi </w:t>
+        <w:t xml:space="preserve">kinh tế - xã hội do UBND phường trình sau khi </w:t>
       </w:r>
       <w:r>
         <w:rPr>
@@ -1794,7 +1794,7 @@
           <w:sz w:val="28"/>
           <w:szCs w:val="28"/>
         </w:rPr>
-        <w:t>Ban Thường vụ Đảng ủy UBND tỉnh (nếu có).</w:t>
+        <w:t xml:space="preserve">Ban Thường vụ Đảng ủy UBND phường XYZ (nếu có).</w:t>
       </w:r>
     </w:p>
     <w:p>
@@ -1824,7 +1824,7 @@
           <w:sz w:val="28"/>
           <w:szCs w:val="28"/>
         </w:rPr>
-        <w:t>Thường trực Đảng ủy UBND tỉnh.</w:t>
+        <w:t xml:space="preserve">Thường trực Đảng ủy UBND phường XYZ.</w:t>
       </w:r>
     </w:p>
     <w:p>
@@ -1853,7 +1853,7 @@
           <w:sz w:val="28"/>
           <w:szCs w:val="28"/>
         </w:rPr>
-        <w:t>UBND tỉnh</w:t>
+        <w:t xml:space="preserve">UBND phường</w:t>
       </w:r>
     </w:p>
     <w:p>
@@ -1993,14 +1993,14 @@
           <w:sz w:val="28"/>
           <w:szCs w:val="28"/>
         </w:rPr>
-        <w:t xml:space="preserve"> Thường trực Đảng ủy </w:t>
-      </w:r>
-      <w:r>
-        <w:rPr>
-          <w:sz w:val="28"/>
-          <w:szCs w:val="28"/>
-        </w:rPr>
-        <w:t>UBND tỉnh</w:t>
+        <w:t xml:space="preserve"> Thường trực Đảng ủy UBND phường XYZ</w:t>
+      </w:r>
+      <w:r>
+        <w:rPr>
+          <w:sz w:val="28"/>
+          <w:szCs w:val="28"/>
+        </w:rPr>
+        <w:t xml:space="preserve"/>
       </w:r>
       <w:r>
         <w:rPr>
@@ -2190,14 +2190,14 @@
           <w:sz w:val="28"/>
           <w:szCs w:val="28"/>
         </w:rPr>
-        <w:t xml:space="preserve"> Thường trực Đảng ủy </w:t>
-      </w:r>
-      <w:r>
-        <w:rPr>
-          <w:sz w:val="28"/>
-          <w:szCs w:val="28"/>
-        </w:rPr>
-        <w:t>UBND tỉnh</w:t>
+        <w:t xml:space="preserve"> Thường trực Đảng ủy UBND phường XYZ</w:t>
+      </w:r>
+      <w:r>
+        <w:rPr>
+          <w:sz w:val="28"/>
+          <w:szCs w:val="28"/>
+        </w:rPr>
+        <w:t xml:space="preserve"/>
       </w:r>
       <w:r>
         <w:rPr>
@@ -2271,7 +2271,7 @@
           <w:sz w:val="28"/>
           <w:szCs w:val="28"/>
         </w:rPr>
-        <w:t>UBND tỉnh</w:t>
+        <w:t xml:space="preserve">UBND phường</w:t>
       </w:r>
       <w:r>
         <w:rPr>
@@ -2355,7 +2355,7 @@
           <w:sz w:val="28"/>
           <w:szCs w:val="28"/>
         </w:rPr>
-        <w:t>UBND tỉnh</w:t>
+        <w:t xml:space="preserve">UBND phường</w:t>
       </w:r>
       <w:r>
         <w:rPr>
@@ -2401,14 +2401,14 @@
           <w:sz w:val="28"/>
           <w:szCs w:val="28"/>
         </w:rPr>
-        <w:t xml:space="preserve"> Thường trực Đảng ủy </w:t>
-      </w:r>
-      <w:r>
-        <w:rPr>
-          <w:sz w:val="28"/>
-          <w:szCs w:val="28"/>
-        </w:rPr>
-        <w:t>UBND tỉnh</w:t>
+        <w:t xml:space="preserve"> Thường trực Đảng ủy UBND phường XYZ</w:t>
+      </w:r>
+      <w:r>
+        <w:rPr>
+          <w:sz w:val="28"/>
+          <w:szCs w:val="28"/>
+        </w:rPr>
+        <w:t xml:space="preserve"/>
       </w:r>
       <w:r>
         <w:rPr>
@@ -2443,7 +2443,7 @@
           <w:sz w:val="28"/>
           <w:szCs w:val="28"/>
         </w:rPr>
-        <w:t>UBND tỉnh</w:t>
+        <w:t xml:space="preserve">UBND phường</w:t>
       </w:r>
       <w:r>
         <w:rPr>
@@ -2629,7 +2629,7 @@
           <w:sz w:val="28"/>
           <w:szCs w:val="28"/>
         </w:rPr>
-        <w:t xml:space="preserve"> lãnh đạo, chỉ đạo UBND tỉnh, các sở, ban, ngành, các tổ chức đảng trực thuộc và các cơ quan chuyên trách tham mưu, giúp việc Đảng ủy chủ động triển khai thực hiện Chương trình này; bảo đảm chuẩn bị đầy đủ, kịp thời các nội dung trình Ban Thường vụ Tỉnh ủy, Ban Thường vụ Đảng ủy</w:t>
+        <w:t xml:space="preserve"> lãnh đạo, chỉ đạo UBND phường, các sở, ban, ngành, các tổ chức đảng trực thuộc và các cơ quan chuyên trách tham mưu, giúp việc Đảng ủy chủ động triển khai thực hiện Chương trình này; bảo đảm chuẩn bị đầy đủ, kịp thời các nội dung trình Ban Thường vụ Tỉnh ủy, Ban Thường vụ Đảng ủy</w:t>
       </w:r>
       <w:r>
         <w:rPr>
@@ -2831,7 +2831,7 @@
               <w:rPr>
                 <w:sz w:val="24"/>
               </w:rPr>
-              <w:t>- Ban Thường vụ Đảng ủy UBND tỉnh;</w:t>
+              <w:t xml:space="preserve">- Ban Thường vụ Đảng ủy UBND phường XYZ;</w:t>
             </w:r>
           </w:p>
           <w:p>
@@ -2852,7 +2852,7 @@
               <w:rPr>
                 <w:sz w:val="24"/>
               </w:rPr>
-              <w:t>UBND tỉnh</w:t>
+              <w:t xml:space="preserve">UBND phường</w:t>
             </w:r>
             <w:r>
               <w:rPr>

</xml_diff>

<commit_message>
feat(demo 17/10): hạ dự thảo văn bản Đảng xuống cấp phường; rà soát lại 897 v2.25 hệ B (25 phát hiện: 0-7-13-5)
Co-Authored-By: Claude Opus 5.5 <noreply@anthropic.com>
</commit_message>
<xml_diff>
--- a/30-Ket-Qua/2026-10-12/De-Mo-17-10/Du-lieu-gia-dinh/D4-Du-thao-can-ra-soat/Du-thao_Chuong-trinh-cong-tac-thang-10-2026_van-ban-Dang_an-danh.docx
+++ b/30-Ket-Qua/2026-10-12/De-Mo-17-10/Du-lieu-gia-dinh/D4-Du-thao-can-ra-soat/Du-thao_Chuong-trinh-cong-tac-thang-10-2026_van-ban-Dang_an-danh.docx
@@ -39,7 +39,7 @@
                 <w:sz w:val="28"/>
                 <w:szCs w:val="28"/>
               </w:rPr>
-              <w:t xml:space="preserve">ĐẢNG BỘ TỈNH A</w:t>
+              <w:t xml:space="preserve">ĐẢNG BỘ PHƯỜNG XYZ</w:t>
             </w:r>
           </w:p>
           <w:p>
@@ -238,7 +238,7 @@
                 <w:sz w:val="28"/>
                 <w:szCs w:val="28"/>
               </w:rPr>
-              <w:t xml:space="preserve">Tỉnh A, ngày   </w:t>
+              <w:t xml:space="preserve">Phường XYZ, ngày   </w:t>
             </w:r>
             <w:r>
               <w:rPr>
@@ -933,7 +933,7 @@
           <w:szCs w:val="28"/>
           <w:shd w:val="clear" w:color="auto" w:fill="FFFFFF"/>
         </w:rPr>
-        <w:t xml:space="preserve"> thuộc trách nhiệm của Ban Thường vụ Đảng ủy UBND phường XYZ để trình Ban Thường vụ Tỉnh ủy trong tháng </w:t>
+        <w:t xml:space="preserve"> thuộc trách nhiệm của Ban Thường vụ Đảng ủy UBND phường XYZ để trình Ban Thường vụ Đảng ủy phường trong tháng </w:t>
       </w:r>
       <w:r>
         <w:rPr>
@@ -988,7 +988,7 @@
           <w:sz w:val="28"/>
           <w:szCs w:val="28"/>
         </w:rPr>
-        <w:t>Tăng cường công tác xây dựng Đảng về chính trị, tư tưởng, đạo đức, tổ chức và cán bộ; kịp thời quán triệt, cụ thể hóa và tổ chức thực hiện các nghị quyết, chỉ thị, kết luận, quy định mới của Trung ương, Tỉnh ủy và Ban Thường vụ Tỉnh ủy. Tập trung triển khai, xây dựng chương trình, kế hoạch thực hiện các nghị quyết, kế hoạch của Tỉnh ủy, Ban Thường vụ Tỉnh ủy; nâng cao chất lượng sinh hoạt chi bộ, công tác phát triển đảng viên, quản lý đảng viên và bảo vệ chính trị nội bộ</w:t>
+        <w:t xml:space="preserve">Tăng cường công tác xây dựng Đảng về chính trị, tư tưởng, đạo đức, tổ chức và cán bộ; kịp thời quán triệt, cụ thể hóa và tổ chức thực hiện các nghị quyết, chỉ thị, kết luận, quy định mới của Trung ương, Tỉnh ủy và Ban Thường vụ Đảng ủy phường. Tập trung triển khai, xây dựng chương trình, kế hoạch thực hiện các nghị quyết, kế hoạch của Tỉnh ủy, Ban Thường vụ Đảng ủy phường; nâng cao chất lượng sinh hoạt chi bộ, công tác phát triển đảng viên, quản lý đảng viên và bảo vệ chính trị nội bộ</w:t>
       </w:r>
       <w:r>
         <w:rPr>
@@ -1151,7 +1151,7 @@
           <w:sz w:val="28"/>
           <w:szCs w:val="28"/>
         </w:rPr>
-        <w:t>CÁC NỘI DUNG TRÌNH BAN THƯỜNG VỤ TỈNH ỦY</w:t>
+        <w:t xml:space="preserve">CÁC NỘI DUNG TRÌNH BAN THƯỜNG VỤ ĐẢNG ỦY PHƯỜNG</w:t>
       </w:r>
       <w:r>
         <w:rPr>
@@ -1188,7 +1188,7 @@
           <w:sz w:val="28"/>
           <w:szCs w:val="28"/>
         </w:rPr>
-        <w:t>Dự thảo Chương trình hành động của Ban Thường vụ Tỉnh ủy thực hiện Nghị quyết số 26-NQ/TW ngày 22/8/2026 của Bộ Chính trị về phát triển du lịch Việt Nam trở thành ngành kinh tế mũi nhọn trong kỷ nguyên mới.</w:t>
+        <w:t xml:space="preserve">Dự thảo Chương trình hành động của Ban Thường vụ Đảng ủy phường thực hiện Nghị quyết số 26-NQ/TW ngày 22/8/2026 của Bộ Chính trị về phát triển du lịch Việt Nam trở thành ngành kinh tế mũi nhọn trong kỷ nguyên mới.</w:t>
       </w:r>
     </w:p>
     <w:p>
@@ -1275,7 +1275,7 @@
           <w:sz w:val="28"/>
           <w:szCs w:val="28"/>
         </w:rPr>
-        <w:t>Sở Văn hóa, Thể thao và Du lịch và các cơ quan liên quan.</w:t>
+        <w:t xml:space="preserve">Phòng Văn hóa - Xã hội và các cơ quan liên quan.</w:t>
       </w:r>
     </w:p>
     <w:p>
@@ -1314,7 +1314,7 @@
           <w:sz w:val="28"/>
           <w:szCs w:val="28"/>
         </w:rPr>
-        <w:t>Dự thảo Chương trình của Ban Thường vụ Tỉnh ủy thực hiện Nghị quyết số 27-NQ/TW ngày 28/8/2026 của Bộ Chính trị về phát triển các vùng và tổ chức không gian phát triển quốc gia trong giai đoạn mới.</w:t>
+        <w:t xml:space="preserve">Dự thảo Chương trình của Ban Thường vụ Đảng ủy phường thực hiện Nghị quyết số 27-NQ/TW ngày 28/8/2026 của Bộ Chính trị về phát triển các vùng và tổ chức không gian phát triển quốc gia trong giai đoạn mới.</w:t>
       </w:r>
     </w:p>
     <w:p>
@@ -1408,7 +1408,7 @@
           <w:sz w:val="28"/>
           <w:szCs w:val="28"/>
         </w:rPr>
-        <w:t xml:space="preserve">Sở </w:t>
+        <w:t xml:space="preserve">Phòng Kinh tế, Hạ tầng và Đô thị</w:t>
       </w:r>
       <w:r>
         <w:rPr>
@@ -1416,7 +1416,7 @@
           <w:sz w:val="28"/>
           <w:szCs w:val="28"/>
         </w:rPr>
-        <w:t>Tài chính</w:t>
+        <w:t xml:space="preserve"/>
       </w:r>
       <w:r>
         <w:rPr>
@@ -1462,7 +1462,7 @@
           <w:sz w:val="28"/>
           <w:szCs w:val="28"/>
         </w:rPr>
-        <w:t>Kế hoạch hoạt động đối ngoại của tỉnh năm 2027</w:t>
+        <w:t xml:space="preserve">Kế hoạch tổ chức đối thoại với Nhân dân trên địa bàn phường năm 2027</w:t>
       </w:r>
     </w:p>
     <w:p>
@@ -1547,14 +1547,14 @@
           <w:sz w:val="28"/>
           <w:szCs w:val="28"/>
         </w:rPr>
-        <w:t xml:space="preserve">Sở </w:t>
-      </w:r>
-      <w:r>
-        <w:rPr>
-          <w:sz w:val="28"/>
-          <w:szCs w:val="28"/>
-        </w:rPr>
-        <w:t>Ngoại vụ</w:t>
+        <w:t xml:space="preserve">Phòng Văn hóa - Xã hội</w:t>
+      </w:r>
+      <w:r>
+        <w:rPr>
+          <w:sz w:val="28"/>
+          <w:szCs w:val="28"/>
+        </w:rPr>
+        <w:t xml:space="preserve"/>
       </w:r>
       <w:r>
         <w:rPr>
@@ -1597,21 +1597,21 @@
           <w:sz w:val="28"/>
           <w:szCs w:val="28"/>
         </w:rPr>
-        <w:t xml:space="preserve">Cho ý kiến chính sách thu hút bác sĩ và đãi ngộ đối với công chức, viên chức ngành y tế tỉnh A giai đoạn 2026 </w:t>
-      </w:r>
-      <w:r>
-        <w:rPr>
-          <w:sz w:val="28"/>
-          <w:szCs w:val="28"/>
-        </w:rPr>
-        <w:t>-</w:t>
-      </w:r>
-      <w:r>
-        <w:rPr>
-          <w:sz w:val="28"/>
-          <w:szCs w:val="28"/>
-        </w:rPr>
-        <w:t xml:space="preserve"> 2030.</w:t>
+        <w:t xml:space="preserve">Cho ý kiến phương án bố trí, sử dụng trụ sở, tài sản công trên địa bàn phường giai đoạn 2026 - 2030</w:t>
+      </w:r>
+      <w:r>
+        <w:rPr>
+          <w:sz w:val="28"/>
+          <w:szCs w:val="28"/>
+        </w:rPr>
+        <w:t xml:space="preserve"/>
+      </w:r>
+      <w:r>
+        <w:rPr>
+          <w:sz w:val="28"/>
+          <w:szCs w:val="28"/>
+        </w:rPr>
+        <w:t xml:space="preserve">.</w:t>
       </w:r>
     </w:p>
     <w:p>
@@ -1703,14 +1703,14 @@
           <w:sz w:val="28"/>
           <w:szCs w:val="28"/>
         </w:rPr>
-        <w:t xml:space="preserve">Sở </w:t>
-      </w:r>
-      <w:r>
-        <w:rPr>
-          <w:sz w:val="28"/>
-          <w:szCs w:val="28"/>
-        </w:rPr>
-        <w:t>Y tế</w:t>
+        <w:t xml:space="preserve">Phòng Kinh tế, Hạ tầng và Đô thị</w:t>
+      </w:r>
+      <w:r>
+        <w:rPr>
+          <w:sz w:val="28"/>
+          <w:szCs w:val="28"/>
+        </w:rPr>
+        <w:t xml:space="preserve"/>
       </w:r>
       <w:r>
         <w:rPr>
@@ -2070,7 +2070,7 @@
           <w:sz w:val="28"/>
           <w:szCs w:val="28"/>
         </w:rPr>
-        <w:t xml:space="preserve"> Sở Nội vụ, Ủy ban Kiểm tra Đảng ủy, Văn phòng Đảng ủy và các tổ chức đảng liên quan.</w:t>
+        <w:t xml:space="preserve"> Văn phòng Hội đồng nhân dân và Ủy ban nhân dân phường, Ủy ban Kiểm tra Đảng ủy, Văn phòng Đảng ủy và các tổ chức đảng liên quan.</w:t>
       </w:r>
     </w:p>
     <w:p>
@@ -2162,7 +2162,7 @@
           <w:sz w:val="28"/>
           <w:szCs w:val="28"/>
         </w:rPr>
-        <w:t xml:space="preserve"> tại Mục II của Chương trình này trước khi trình Ban Thường vụ Tỉnh ủy.</w:t>
+        <w:t xml:space="preserve"> tại Mục II của Chương trình này trước khi trình Ban Thường vụ Đảng ủy phường.</w:t>
       </w:r>
     </w:p>
     <w:p>
@@ -2314,7 +2314,7 @@
           <w:sz w:val="28"/>
           <w:szCs w:val="28"/>
         </w:rPr>
-        <w:t>Trình Ban Thường vụ Đảng ủy xem xét, cho ý kiến trước thời hạn báo cáo Ban Thường vụ Tỉnh ủy đối với từng nội dung.</w:t>
+        <w:t xml:space="preserve">Trình Ban Thường vụ Đảng ủy xem xét, cho ý kiến trước thời hạn báo cáo Ban Thường vụ Đảng ủy phường đối với từng nội dung.</w:t>
       </w:r>
     </w:p>
     <w:p>
@@ -2364,7 +2364,7 @@
           <w:sz w:val="28"/>
           <w:szCs w:val="28"/>
         </w:rPr>
-        <w:t xml:space="preserve"> trình xin ý kiến Ban Thường vụ Đảng ủy trước khi trình Ban Thường vụ Tỉnh ủy xem xét, cho ý kiến theo thẩm quyền</w:t>
+        <w:t xml:space="preserve"> trình xin ý kiến Ban Thường vụ Đảng ủy trước khi trình Ban Thường vụ Đảng ủy phường xem xét, cho ý kiến theo thẩm quyền</w:t>
       </w:r>
       <w:r>
         <w:rPr>
@@ -2513,7 +2513,7 @@
           <w:sz w:val="28"/>
           <w:szCs w:val="28"/>
         </w:rPr>
-        <w:t xml:space="preserve">Theo chương trình làm việc của Ban Thường vụ Đảng ủy và tiến độ trình Ban Thường vụ Tỉnh ủy trong tháng </w:t>
+        <w:t xml:space="preserve">Theo chương trình làm việc của Ban Thường vụ Đảng ủy và tiến độ trình Ban Thường vụ Đảng ủy phường trong tháng </w:t>
       </w:r>
       <w:r>
         <w:rPr>
@@ -2629,7 +2629,7 @@
           <w:sz w:val="28"/>
           <w:szCs w:val="28"/>
         </w:rPr>
-        <w:t xml:space="preserve"> lãnh đạo, chỉ đạo UBND phường, các sở, ban, ngành, các tổ chức đảng trực thuộc và các cơ quan chuyên trách tham mưu, giúp việc Đảng ủy chủ động triển khai thực hiện Chương trình này; bảo đảm chuẩn bị đầy đủ, kịp thời các nội dung trình Ban Thường vụ Tỉnh ủy, Ban Thường vụ Đảng ủy</w:t>
+        <w:t xml:space="preserve"> lãnh đạo, chỉ đạo UBND phường, các phòng chuyên môn, các tổ chức đảng trực thuộc và các cơ quan chuyên trách tham mưu, giúp việc Đảng ủy chủ động triển khai thực hiện Chương trình này; bảo đảm chuẩn bị đầy đủ, kịp thời các nội dung trình Ban Thường vụ Đảng ủy phường, Ban Thường vụ Đảng ủy</w:t>
       </w:r>
       <w:r>
         <w:rPr>
@@ -2741,7 +2741,7 @@
           <w:sz w:val="28"/>
           <w:szCs w:val="28"/>
         </w:rPr>
-        <w:t>Văn phòng Đảng ủy theo dõi, đôn đốc, tổng hợp tình hình thực hiện Chương trình; tham mưu lịch công tác và chương trình các phiên họp, hội nghị. Quá trình triển khai thực hiện, Ban Thường vụ Đảng ủy ủy quyền Thường trực Đảng ủy căn cứ chỉ đạo của Tỉnh ủy, tình hình thực tế và đề nghị của các cơ quan, đơn vị để điều chỉnh thời gian, bổ sung các nhiệm vụ phát sinh; báo cáo Ban Thường vụ Đảng ủy tại phiên họp gần nhất.</w:t>
+        <w:t xml:space="preserve">Văn phòng Đảng ủy theo dõi, đôn đốc, tổng hợp tình hình thực hiện Chương trình; tham mưu lịch công tác và chương trình các phiên họp, hội nghị. Quá trình triển khai thực hiện, Ban Thường vụ Đảng ủy ủy quyền Thường trực Đảng ủy căn cứ chỉ đạo của Đảng ủy phường, tình hình thực tế và đề nghị của các cơ quan, đơn vị để điều chỉnh thời gian, bổ sung các nhiệm vụ phát sinh; báo cáo Ban Thường vụ Đảng ủy tại phiên họp gần nhất.</w:t>
       </w:r>
     </w:p>
     <w:p>
@@ -2816,7 +2816,7 @@
               <w:rPr>
                 <w:sz w:val="24"/>
               </w:rPr>
-              <w:t>- Ban Thường vụ Tỉnh ủy;</w:t>
+              <w:t xml:space="preserve">- Ban Thường vụ Đảng ủy phường;</w:t>
             </w:r>
           </w:p>
           <w:p>
@@ -2888,13 +2888,13 @@
               <w:rPr>
                 <w:sz w:val="24"/>
               </w:rPr>
-              <w:t xml:space="preserve">- Các </w:t>
+              <w:t xml:space="preserve">- Các chi bộ trực thuộc</w:t>
             </w:r>
             <w:r>
               <w:rPr>
                 <w:sz w:val="24"/>
               </w:rPr>
-              <w:t>chi bộ, đảng bộ trực thuộc cơ sở;</w:t>
+              <w:t xml:space="preserve">;</w:t>
             </w:r>
           </w:p>
           <w:p>

</xml_diff>